<commit_message>
Discussion rewrite: conditional closure examples, stock-flow interaction, bug fix
Key changes:
- Discussion 6.2: Added parallel examples of conditional closure with
  selective technology channels (Tokugawa rangaku, Qing Canton system,
  Joseon tributary trade, Soviet bloc sharing, North Korea-China).
  Presented mixed outcomes honestly — some survived, some did not —
  noting unmeasured confounders and leaving interpretation to readers.
- Discussion 6.4: Added quantitative stock × closure interaction rates
  (stock+closed 83.3% vs stock+open 66.7% vs flow+open 57.4%).
  Expanded resource-base transition discussion.
- Fixed p.style.font.size bug (was corrupting global Normal style to
  11pt; now uses per-run font.size)
- All scripts regenerated successfully

Co-Authored-By: Tatsuki Onishi <bougtoir@gmail.com>
</commit_message>
<xml_diff>
--- a/manuscript/manuscript.docx
+++ b/manuscript/manuscript.docx
@@ -46,6 +46,9 @@
     </w:p>
     <w:p>
       <w:r>
+        <w:rPr>
+          <w:sz w:val="22"/>
+        </w:rPr>
         <w:t>Why do some states collapse while others endure? This study proposes that structural exclusion from the dominant technological network of an era—not merely deliberate trade closure—is a recurring driver of state vulnerability, because it severs the flow of technical knowledge and allows a cumulative technology gap to open between connected and excluded polities. Using a comparative dataset of 96 historical polities spanning antiquity to the present, we distinguish between policy-driven isolation (e.g., Ming haijin, Tokugawa sakoku) and what we term 'technical network exclusion': involuntary disconnection from prevailing exchange networks due to geographic or technological constraints. Policy-based closure reduces but does not eliminate technology transfer (e.g., rangaku via Dejima under sakoku), whereas technical exclusion severs it entirely. Reclassifying seven technically excluded polities transforms a non-significant association between closure and conquest (Fisher's exact test p = 0.187) into a significant one (p = 0.020); all seven were eventually conquered. Multivariate logistic regression confirms that external threat and institutional quality are the strongest predictors of collapse, while the stock–flow odds ratio (OR = 1.774) remains stable across all scenarios. We argue that the underlying mechanism—technology flow disruption leading to an accumulating civilization-level gap—generalizes beyond maritime isolation. As the dominant network shifts from sea lanes to semiconductors, artificial intelligence, and advanced robotics, states structurally excluded from these technological platforms may face analogous vulnerabilities.</w:t>
       </w:r>
     </w:p>
@@ -2554,7 +2557,7 @@
     </w:p>
     <w:p>
       <w:r>
-        <w:t>The dose–response pattern in Figure 3 reinforces this interpretation. Technical exclusion (zero technology transfer) produces a 100% conquest rate. Policy-based maritime bans, which restrict but do not eliminate technology flow—Tokugawa Japan, for instance, maintained access to Western science through rangaku at Dejima—show conquest rates below 80%. Bloc closures, which preserve substantial within-bloc technology sharing, show the lowest rates among closure types. The ordering of conquest risk mirrors the ordering of technology flow disruption.</w:t>
+        <w:t>The dose–response pattern in Figure 3 reinforces this interpretation. Technical exclusion (zero technology transfer) produces a 100% conquest rate. Policy-based maritime bans, which restrict but do not eliminate technology flow, show conquest rates below 80%. The case of Tokugawa Japan is particularly instructive: despite the comprehensive closure of sakoku, the Tokugawa regime deliberately maintained a narrow conduit for Western scientific and technical knowledge (rangaku) through the Dutch trading post at Dejima. This selective preservation of a technology transfer channel—even within an otherwise closed system—appears to have made a material difference. Japan was disrupted by the forced opening of 1853–54 but was not conquered; it reconstituted itself as the Meiji state and rapidly closed the technology gap. Bloc closures, which preserve substantial within-bloc technology sharing, show the lowest rates among closure categories. The ordering of conquest risk mirrors the ordering of technology flow disruption.</w:t>
       </w:r>
     </w:p>
     <w:p>
@@ -2583,6 +2586,16 @@
     <w:p>
       <w:r>
         <w:t>Crucially, the tragedy of first contact is a function of the gap, not of the contact itself. Policy-closed polities that maintained narrow conduits of technology transfer—Japan's rangaku, Qing China's limited Canton trade—accumulated smaller gaps and, correspondingly, were more likely to survive or reconstitute after disruption. The implication is that what determines the outcome of civilizational encounter is the degree and duration of technology flow disruption that preceded it.</w:t>
+      </w:r>
+    </w:p>
+    <w:p>
+      <w:r>
+        <w:t>This finding has a corollary that is worth stating explicitly. If the critical variable is not closure itself but the residual technology flow that closure permits, then polities that close their borders while deliberately maintaining selective channels for frontier knowledge occupy a qualitatively different position from those that are totally severed. Our dataset contains several instances of such conditional closure. Tokugawa Japan preserved access to Western science through rangaku at Dejima and was disrupted but not conquered, reconstituting itself as the Meiji state. Early Qing China maintained the Canton system—a single, tightly controlled port of trade through which some foreign knowledge filtered—and survived the Kangxi–Qianlong era intact. Joseon Korea sustained tributary trade with China, which served as a conduit for Continental knowledge and technology. The Soviet Union, while sealed from the Western bloc, maintained extensive technology sharing within the Eastern bloc and invested heavily in indigenous research institutions. North Korea has preserved a limited technology channel through its relationship with China.</w:t>
+      </w:r>
+    </w:p>
+    <w:p>
+      <w:r>
+        <w:t>The outcomes, however, are mixed. Early Qing China survived, but late Qing China—operating under the same Canton system—was semi-colonized after the Opium Wars. Tokugawa Japan survived as a political entity, but Joseon Korea, despite its Chinese conduit, was annexed by Japan in 1910. The Soviet Union collapsed internally despite its bloc-level technology sharing, while North Korea has persisted under extreme isolation with minimal Chinese patronage. These divergent outcomes suggest that the mere existence of a selective channel does not guarantee survival; unmeasured factors—the breadth and relevance of the knowledge flowing through the channel, the domestic capacity to absorb and adapt that knowledge, the pace of change at the technological frontier, and institutional dynamics that our dataset does not capture—likely condition the effectiveness of conditional closure. The policy question, then, is not binary (open or closed) but conditional, and the conditions under which selective channels suffice to prevent a fatal technology gap remain an open and consequential problem for future research.</w:t>
       </w:r>
     </w:p>
     <w:p>
@@ -2618,12 +2631,17 @@
         <w:pStyle w:val="Heading2"/>
       </w:pPr>
       <w:r>
-        <w:t>6.4  Robustness of the stock–flow framework</w:t>
+        <w:t>6.4  Robustness of the stock–flow framework and the question of resource-base transitions</w:t>
       </w:r>
     </w:p>
     <w:p>
       <w:r>
-        <w:t>The invariance of the stock–flow OR (1.774) across all reclassification scenarios confirms that the core finding of the stock–flow framework—that stock-oriented polities face moderately higher conquest risk—is independent of how maritime isolation is defined. The reclassification changes the closure subanalysis but leaves the primary classification untouched. This separation is analytically useful: it shows that the stock–flow distinction and the closure–conquest association capture related but distinct dimensions of state vulnerability.</w:t>
+        <w:t>The invariance of the stock–flow OR (1.774) across all reclassification scenarios confirms that the core finding of the stock–flow framework—that stock-oriented polities face moderately higher conquest risk—is independent of how maritime isolation is defined. The reclassification changes the closure subanalysis but leaves the primary classification untouched. This separation is analytically useful: it shows that the stock–flow distinction and the closure–conquest association capture related but distinct dimensions of state vulnerability. When these two dimensions are crossed, the interaction is suggestive: among stock-oriented polities, those with some form of maritime closure show a conquest rate of 83.3% (n = 18), compared with 66.7% (n = 27) for stock-oriented polities without closure. Among flow-oriented polities, the corresponding figures are 100.0% (n = 4) and 57.4% (n = 47). While cell sizes are too small for reliable inference, the pattern is consistent with the hypothesis that stock-orientation and network exclusion compound each other's risk.</w:t>
+      </w:r>
+    </w:p>
+    <w:p>
+      <w:r>
+        <w:t>An implication worth noting is that the stock–flow distinction is not permanently fixed for any given state. Polities can transition from flow-oriented to stock-oriented resource bases—or vice versa—as economic structures, demographic conditions, and institutional incentives evolve. A state that was historically flow-oriented (trade-dependent, outward-looking, innovation-absorbing) but that gradually shifts toward reliance on accumulated domestic assets—physical capital, territorial resources, existing institutional infrastructure—moves into the higher-risk stock category. If such a transition coincides with reduced engagement in the dominant technological network of the era, the compounding of stock-orientation and network exclusion could amplify vulnerability. Our dataset cannot test this dynamic directly, as polities are coded at a single point in time, but the theoretical interaction between resource-base transition and network access merits further investigation.</w:t>
       </w:r>
     </w:p>
     <w:p>
@@ -2654,7 +2672,7 @@
     </w:p>
     <w:p>
       <w:r>
-        <w:t>The broader implication is that this mechanism is not specific to maritime trade. In every era, there exists a dominant network through which frontier technologies diffuse. Polities excluded from that network—whether by oceans, mountains, policy, or, in the contemporary period, by semiconductor export controls and AI infrastructure concentration—risk falling into the same pattern of cumulative divergence. The historical record we document provides a quantitative baseline for assessing this risk. Whether the tragedy of first contact between unequally developed civilizations will find new expression in the age of artificial intelligence is a question that the coming decades will answer; our analysis suggests it is one worth asking.</w:t>
+        <w:t>The broader implication is that this mechanism is not specific to maritime trade. In every era, there exists a dominant network through which frontier technologies diffuse. Polities excluded from that network—whether by oceans, mountains, policy, or, in the contemporary period, by semiconductor export controls and AI infrastructure concentration—risk falling into the same pattern of cumulative divergence. The historical record we document provides a quantitative baseline for assessing this risk. Whether the tragedy of first contact between unequally developed civilizations will find new expression in the age of artificial intelligence is a question that the coming decades will answer; our analysis suggests it is one worth asking. Equally pressing is the converse question suggested by the Tokugawa precedent: whether a state that recognizes the risk of network exclusion can, through deliberate maintenance of selective technology channels, prevent the accumulation of a fatal gap—even while restricting broader engagement with the outside world.</w:t>
       </w:r>
     </w:p>
     <w:p>
@@ -2670,6 +2688,9 @@
         <w:ind w:hanging="567" w:left="567"/>
       </w:pPr>
       <w:r>
+        <w:rPr>
+          <w:sz w:val="22"/>
+        </w:rPr>
         <w:t>Acemoglu D, Johnson S, Robinson JA (2002) Reversal of fortune: geography and institutions in the making of the modern world income distribution. Q J Econ 117:1231–1294. https://doi.org/10.1162/003355302320935025</w:t>
       </w:r>
     </w:p>
@@ -2678,6 +2699,9 @@
         <w:ind w:hanging="567" w:left="567"/>
       </w:pPr>
       <w:r>
+        <w:rPr>
+          <w:sz w:val="22"/>
+        </w:rPr>
         <w:t>Acemoglu D, Johnson S, Robinson JA (2005) Institutions as a fundamental cause of long-run growth. In: Aghion P, Durlauf SN (eds) Handbook of economic growth, vol 1A. Elsevier, Amsterdam, pp 385–472</w:t>
       </w:r>
     </w:p>
@@ -2686,6 +2710,9 @@
         <w:ind w:hanging="567" w:left="567"/>
       </w:pPr>
       <w:r>
+        <w:rPr>
+          <w:sz w:val="22"/>
+        </w:rPr>
         <w:t>Acemoglu D, Restrepo P (2020) Robots and jobs: evidence from US labor markets. J Polit Econ 128:2188–2244. https://doi.org/10.1086/705716</w:t>
       </w:r>
     </w:p>
@@ -2694,6 +2721,9 @@
         <w:ind w:hanging="567" w:left="567"/>
       </w:pPr>
       <w:r>
+        <w:rPr>
+          <w:sz w:val="22"/>
+        </w:rPr>
         <w:t>Arrighi G (1994) The long twentieth century: money, power, and the origins of our times. Verso, London</w:t>
       </w:r>
     </w:p>
@@ -2702,6 +2732,9 @@
         <w:ind w:hanging="567" w:left="567"/>
       </w:pPr>
       <w:r>
+        <w:rPr>
+          <w:sz w:val="22"/>
+        </w:rPr>
         <w:t>Broadberry SN, Guan H (2026) Regional variation of GDP per head within China, 1080–1850. Explor Econ Hist 95:101567. https://doi.org/10.1016/j.eeh.2025.101567</w:t>
       </w:r>
     </w:p>
@@ -2710,6 +2743,9 @@
         <w:ind w:hanging="567" w:left="567"/>
       </w:pPr>
       <w:r>
+        <w:rPr>
+          <w:sz w:val="22"/>
+        </w:rPr>
         <w:t>Comin D, Easterly W, Gong E (2010) Was the wealth of nations determined in 1000 BC? Am Econ J Macroecon 2:65–97. https://doi.org/10.1257/mac.2.3.65</w:t>
       </w:r>
     </w:p>
@@ -2718,6 +2754,9 @@
         <w:ind w:hanging="567" w:left="567"/>
       </w:pPr>
       <w:r>
+        <w:rPr>
+          <w:sz w:val="22"/>
+        </w:rPr>
         <w:t>Comin D, Mestieri M (2018) If technology has arrived everywhere, why has income diverged? Am Econ J Macroecon 10:137–178. https://doi.org/10.1257/mac.20150175</w:t>
       </w:r>
     </w:p>
@@ -2726,6 +2765,9 @@
         <w:ind w:hanging="567" w:left="567"/>
       </w:pPr>
       <w:r>
+        <w:rPr>
+          <w:sz w:val="22"/>
+        </w:rPr>
         <w:t>De Vries J (2010) The limits of globalization in the early modern world. Econ Hist Rev 63:710–733. https://doi.org/10.1111/j.1468-0289.2009.00497.x</w:t>
       </w:r>
     </w:p>
@@ -2734,6 +2776,9 @@
         <w:ind w:hanging="567" w:left="567"/>
       </w:pPr>
       <w:r>
+        <w:rPr>
+          <w:sz w:val="22"/>
+        </w:rPr>
         <w:t>Diamond J (1997) Guns, germs, and steel: the fates of human societies. W.W. Norton, New York</w:t>
       </w:r>
     </w:p>
@@ -2742,6 +2787,9 @@
         <w:ind w:hanging="567" w:left="567"/>
       </w:pPr>
       <w:r>
+        <w:rPr>
+          <w:sz w:val="22"/>
+        </w:rPr>
         <w:t>Diamond J, Bellwood P (2003) Farmers and their languages: the first expansions. Science 300:597–603. https://doi.org/10.1126/science.1078208</w:t>
       </w:r>
     </w:p>
@@ -2750,6 +2798,9 @@
         <w:ind w:hanging="567" w:left="567"/>
       </w:pPr>
       <w:r>
+        <w:rPr>
+          <w:sz w:val="22"/>
+        </w:rPr>
         <w:t>Findlay R, O'Rourke KH (2007) Power and plenty: trade, war, and the world economy in the second millennium. Princeton University Press, Princeton</w:t>
       </w:r>
     </w:p>
@@ -2758,6 +2809,9 @@
         <w:ind w:hanging="567" w:left="567"/>
       </w:pPr>
       <w:r>
+        <w:rPr>
+          <w:sz w:val="22"/>
+        </w:rPr>
         <w:t>Kennedy P (1987) The rise and fall of the great powers: economic change and military conflict from 1500 to 2000. Random House, New York</w:t>
       </w:r>
     </w:p>
@@ -2766,6 +2820,9 @@
         <w:ind w:hanging="567" w:left="567"/>
       </w:pPr>
       <w:r>
+        <w:rPr>
+          <w:sz w:val="22"/>
+        </w:rPr>
         <w:t>Maddison A (2007) Contours of the world economy 1–2030 AD: essays in macro-economic history. Oxford University Press, Oxford</w:t>
       </w:r>
     </w:p>
@@ -2774,6 +2831,9 @@
         <w:ind w:hanging="567" w:left="567"/>
       </w:pPr>
       <w:r>
+        <w:rPr>
+          <w:sz w:val="22"/>
+        </w:rPr>
         <w:t>Mokyr J (2002) The gifts of Athena: historical origins of the knowledge economy. Princeton University Press, Princeton</w:t>
       </w:r>
     </w:p>
@@ -2782,6 +2842,9 @@
         <w:ind w:hanging="567" w:left="567"/>
       </w:pPr>
       <w:r>
+        <w:rPr>
+          <w:sz w:val="22"/>
+        </w:rPr>
         <w:t>North DC, Wallis JJ, Weingast BR (2009) Violence and social orders: a conceptual framework for interpreting recorded human history. Cambridge University Press, Cambridge</w:t>
       </w:r>
     </w:p>
@@ -2790,6 +2853,9 @@
         <w:ind w:hanging="567" w:left="567"/>
       </w:pPr>
       <w:r>
+        <w:rPr>
+          <w:sz w:val="22"/>
+        </w:rPr>
         <w:t>Pomeranz K (2000) The great divergence: China, Europe, and the making of the modern world economy. Princeton University Press, Princeton</w:t>
       </w:r>
     </w:p>
@@ -2798,6 +2864,9 @@
         <w:ind w:hanging="567" w:left="567"/>
       </w:pPr>
       <w:r>
+        <w:rPr>
+          <w:sz w:val="22"/>
+        </w:rPr>
         <w:t>Turchin P (2009) A theory for formation of large empires. J Glob Hist 4:191–217. https://doi.org/10.1017/S1740022809003192</w:t>
       </w:r>
     </w:p>
@@ -3226,7 +3295,7 @@
     </w:pPr>
     <w:rPr>
       <w:rFonts w:ascii="Times New Roman" w:hAnsi="Times New Roman"/>
-      <w:sz w:val="22"/>
+      <w:sz w:val="24"/>
     </w:rPr>
   </w:style>
   <w:style w:type="paragraph" w:styleId="Header">

</xml_diff>

<commit_message>
Discussion 6.4: Add Table 4 (stock×closure 4-cell cross-tabulation) with Fisher exact tests
- Stock+closed: 83.3%, Stock+open: 66.7%, Flow+closed: 100%, Flow+open: 57.4%
- Fisher tests: stock+closed vs flow+open OR=3.70 p=0.045;
  within-stock closure effect OR=2.50 p=0.187;
  within-flow closure effect OR=inf p=0.126
- Table 4 added inline with footnote showing all test statistics
- flow+closed cell now explicitly reported (n=4, 100%)

Co-Authored-By: Tatsuki Onishi <bougtoir@gmail.com>
</commit_message>
<xml_diff>
--- a/manuscript/manuscript.docx
+++ b/manuscript/manuscript.docx
@@ -2636,7 +2636,468 @@
     </w:p>
     <w:p>
       <w:r>
-        <w:t>The invariance of the stock–flow OR (1.774) across all reclassification scenarios confirms that the core finding of the stock–flow framework—that stock-oriented polities face moderately higher conquest risk—is independent of how maritime isolation is defined. The reclassification changes the closure subanalysis but leaves the primary classification untouched. This separation is analytically useful: it shows that the stock–flow distinction and the closure–conquest association capture related but distinct dimensions of state vulnerability. When these two dimensions are crossed, the interaction is suggestive: among stock-oriented polities, those with some form of maritime closure show a conquest rate of 83.3% (n = 18), compared with 66.7% (n = 27) for stock-oriented polities without closure. Among flow-oriented polities, the corresponding figures are 100.0% (n = 4) and 57.4% (n = 47). While cell sizes are too small for reliable inference, the pattern is consistent with the hypothesis that stock-orientation and network exclusion compound each other's risk.</w:t>
+        <w:t>The invariance of the stock–flow OR (1.774) across all reclassification scenarios confirms that the core finding of the stock–flow framework—that stock-oriented polities face moderately higher conquest risk—is independent of how maritime isolation is defined. The reclassification changes the closure subanalysis but leaves the primary classification untouched. This separation is analytically useful: it shows that the stock–flow distinction and the closure–conquest association capture related but distinct dimensions of state vulnerability.</w:t>
+      </w:r>
+    </w:p>
+    <w:p>
+      <w:r>
+        <w:t>Crossing these two dimensions yields a four-cell classification whose conquest rates are reported in Table 4. Flow-oriented polities without closure show the lowest conquest rate (57.4%, n = 47). Stock-oriented polities without closure show a moderately elevated rate (66.7%, n = 27). Stock-oriented polities with closure show a markedly higher rate (83.3%, n = 18). Flow-oriented polities with closure—a small cell (n = 4)—show a 100.0% conquest rate. The contrast between the highest- and lowest-risk cells (stock + closed vs. flow + open) yields an odds ratio of 3.70 (one-sided Fisher exact p = 0.045). Within stock-oriented polities, the effect of closure corresponds to an OR of 2.50 (p = 0.187). Within flow-oriented polities, the effect of closure yields an OR of ∞ (p = 0.126), though the cell size (n = 4) precludes reliable inference.</w:t>
+      </w:r>
+    </w:p>
+    <w:p/>
+    <w:p>
+      <w:pPr>
+        <w:jc w:val="center"/>
+      </w:pPr>
+      <w:r>
+        <w:rPr>
+          <w:b/>
+          <w:sz w:val="20"/>
+        </w:rPr>
+        <w:t>Table 4  Conquest rates by resource-base orientation and closure status (7-country reclassification, disrupted = conquered)</w:t>
+      </w:r>
+    </w:p>
+    <w:tbl>
+      <w:tblPr>
+        <w:tblStyle w:val="TableGrid"/>
+        <w:tblW w:type="auto" w:w="0"/>
+        <w:jc w:val="center"/>
+        <w:tblLook w:firstColumn="1" w:firstRow="1" w:lastColumn="0" w:lastRow="0" w:noHBand="0" w:noVBand="1" w:val="04A0"/>
+      </w:tblPr>
+      <w:tblGrid>
+        <w:gridCol w:w="1881"/>
+        <w:gridCol w:w="1881"/>
+        <w:gridCol w:w="1881"/>
+        <w:gridCol w:w="1881"/>
+        <w:gridCol w:w="1881"/>
+      </w:tblGrid>
+      <w:tr>
+        <w:tc>
+          <w:tcPr>
+            <w:tcW w:type="dxa" w:w="1881"/>
+          </w:tcPr>
+          <w:p>
+            <w:pPr>
+              <w:jc w:val="center"/>
+            </w:pPr>
+            <w:r>
+              <w:rPr>
+                <w:b/>
+                <w:sz w:val="20"/>
+              </w:rPr>
+            </w:r>
+          </w:p>
+        </w:tc>
+        <w:tc>
+          <w:tcPr>
+            <w:tcW w:type="dxa" w:w="1881"/>
+          </w:tcPr>
+          <w:p>
+            <w:pPr>
+              <w:jc w:val="center"/>
+            </w:pPr>
+            <w:r>
+              <w:rPr>
+                <w:b/>
+                <w:sz w:val="20"/>
+              </w:rPr>
+              <w:t>Conquered</w:t>
+            </w:r>
+          </w:p>
+        </w:tc>
+        <w:tc>
+          <w:tcPr>
+            <w:tcW w:type="dxa" w:w="1881"/>
+          </w:tcPr>
+          <w:p>
+            <w:pPr>
+              <w:jc w:val="center"/>
+            </w:pPr>
+            <w:r>
+              <w:rPr>
+                <w:b/>
+                <w:sz w:val="20"/>
+              </w:rPr>
+              <w:t>Survived</w:t>
+            </w:r>
+          </w:p>
+        </w:tc>
+        <w:tc>
+          <w:tcPr>
+            <w:tcW w:type="dxa" w:w="1881"/>
+          </w:tcPr>
+          <w:p>
+            <w:pPr>
+              <w:jc w:val="center"/>
+            </w:pPr>
+            <w:r>
+              <w:rPr>
+                <w:b/>
+                <w:sz w:val="20"/>
+              </w:rPr>
+              <w:t>n</w:t>
+            </w:r>
+          </w:p>
+        </w:tc>
+        <w:tc>
+          <w:tcPr>
+            <w:tcW w:type="dxa" w:w="1881"/>
+          </w:tcPr>
+          <w:p>
+            <w:pPr>
+              <w:jc w:val="center"/>
+            </w:pPr>
+            <w:r>
+              <w:rPr>
+                <w:b/>
+                <w:sz w:val="20"/>
+              </w:rPr>
+              <w:t>Rate</w:t>
+            </w:r>
+          </w:p>
+        </w:tc>
+      </w:tr>
+      <w:tr>
+        <w:tc>
+          <w:tcPr>
+            <w:tcW w:type="dxa" w:w="1881"/>
+          </w:tcPr>
+          <w:p>
+            <w:pPr>
+              <w:jc w:val="center"/>
+            </w:pPr>
+            <w:r>
+              <w:rPr>
+                <w:sz w:val="20"/>
+              </w:rPr>
+              <w:t>Stock + closed</w:t>
+            </w:r>
+          </w:p>
+        </w:tc>
+        <w:tc>
+          <w:tcPr>
+            <w:tcW w:type="dxa" w:w="1881"/>
+          </w:tcPr>
+          <w:p>
+            <w:pPr>
+              <w:jc w:val="center"/>
+            </w:pPr>
+            <w:r>
+              <w:rPr>
+                <w:sz w:val="20"/>
+              </w:rPr>
+              <w:t>15</w:t>
+            </w:r>
+          </w:p>
+        </w:tc>
+        <w:tc>
+          <w:tcPr>
+            <w:tcW w:type="dxa" w:w="1881"/>
+          </w:tcPr>
+          <w:p>
+            <w:pPr>
+              <w:jc w:val="center"/>
+            </w:pPr>
+            <w:r>
+              <w:rPr>
+                <w:sz w:val="20"/>
+              </w:rPr>
+              <w:t>3</w:t>
+            </w:r>
+          </w:p>
+        </w:tc>
+        <w:tc>
+          <w:tcPr>
+            <w:tcW w:type="dxa" w:w="1881"/>
+          </w:tcPr>
+          <w:p>
+            <w:pPr>
+              <w:jc w:val="center"/>
+            </w:pPr>
+            <w:r>
+              <w:rPr>
+                <w:sz w:val="20"/>
+              </w:rPr>
+              <w:t>18</w:t>
+            </w:r>
+          </w:p>
+        </w:tc>
+        <w:tc>
+          <w:tcPr>
+            <w:tcW w:type="dxa" w:w="1881"/>
+          </w:tcPr>
+          <w:p>
+            <w:pPr>
+              <w:jc w:val="center"/>
+            </w:pPr>
+            <w:r>
+              <w:rPr>
+                <w:sz w:val="20"/>
+              </w:rPr>
+              <w:t>83.3%</w:t>
+            </w:r>
+          </w:p>
+        </w:tc>
+      </w:tr>
+      <w:tr>
+        <w:tc>
+          <w:tcPr>
+            <w:tcW w:type="dxa" w:w="1881"/>
+          </w:tcPr>
+          <w:p>
+            <w:pPr>
+              <w:jc w:val="center"/>
+            </w:pPr>
+            <w:r>
+              <w:rPr>
+                <w:sz w:val="20"/>
+              </w:rPr>
+              <w:t>Stock + open</w:t>
+            </w:r>
+          </w:p>
+        </w:tc>
+        <w:tc>
+          <w:tcPr>
+            <w:tcW w:type="dxa" w:w="1881"/>
+          </w:tcPr>
+          <w:p>
+            <w:pPr>
+              <w:jc w:val="center"/>
+            </w:pPr>
+            <w:r>
+              <w:rPr>
+                <w:sz w:val="20"/>
+              </w:rPr>
+              <w:t>18</w:t>
+            </w:r>
+          </w:p>
+        </w:tc>
+        <w:tc>
+          <w:tcPr>
+            <w:tcW w:type="dxa" w:w="1881"/>
+          </w:tcPr>
+          <w:p>
+            <w:pPr>
+              <w:jc w:val="center"/>
+            </w:pPr>
+            <w:r>
+              <w:rPr>
+                <w:sz w:val="20"/>
+              </w:rPr>
+              <w:t>9</w:t>
+            </w:r>
+          </w:p>
+        </w:tc>
+        <w:tc>
+          <w:tcPr>
+            <w:tcW w:type="dxa" w:w="1881"/>
+          </w:tcPr>
+          <w:p>
+            <w:pPr>
+              <w:jc w:val="center"/>
+            </w:pPr>
+            <w:r>
+              <w:rPr>
+                <w:sz w:val="20"/>
+              </w:rPr>
+              <w:t>27</w:t>
+            </w:r>
+          </w:p>
+        </w:tc>
+        <w:tc>
+          <w:tcPr>
+            <w:tcW w:type="dxa" w:w="1881"/>
+          </w:tcPr>
+          <w:p>
+            <w:pPr>
+              <w:jc w:val="center"/>
+            </w:pPr>
+            <w:r>
+              <w:rPr>
+                <w:sz w:val="20"/>
+              </w:rPr>
+              <w:t>66.7%</w:t>
+            </w:r>
+          </w:p>
+        </w:tc>
+      </w:tr>
+      <w:tr>
+        <w:tc>
+          <w:tcPr>
+            <w:tcW w:type="dxa" w:w="1881"/>
+          </w:tcPr>
+          <w:p>
+            <w:pPr>
+              <w:jc w:val="center"/>
+            </w:pPr>
+            <w:r>
+              <w:rPr>
+                <w:sz w:val="20"/>
+              </w:rPr>
+              <w:t>Flow + closed</w:t>
+            </w:r>
+          </w:p>
+        </w:tc>
+        <w:tc>
+          <w:tcPr>
+            <w:tcW w:type="dxa" w:w="1881"/>
+          </w:tcPr>
+          <w:p>
+            <w:pPr>
+              <w:jc w:val="center"/>
+            </w:pPr>
+            <w:r>
+              <w:rPr>
+                <w:sz w:val="20"/>
+              </w:rPr>
+              <w:t>4</w:t>
+            </w:r>
+          </w:p>
+        </w:tc>
+        <w:tc>
+          <w:tcPr>
+            <w:tcW w:type="dxa" w:w="1881"/>
+          </w:tcPr>
+          <w:p>
+            <w:pPr>
+              <w:jc w:val="center"/>
+            </w:pPr>
+            <w:r>
+              <w:rPr>
+                <w:sz w:val="20"/>
+              </w:rPr>
+              <w:t>0</w:t>
+            </w:r>
+          </w:p>
+        </w:tc>
+        <w:tc>
+          <w:tcPr>
+            <w:tcW w:type="dxa" w:w="1881"/>
+          </w:tcPr>
+          <w:p>
+            <w:pPr>
+              <w:jc w:val="center"/>
+            </w:pPr>
+            <w:r>
+              <w:rPr>
+                <w:sz w:val="20"/>
+              </w:rPr>
+              <w:t>4</w:t>
+            </w:r>
+          </w:p>
+        </w:tc>
+        <w:tc>
+          <w:tcPr>
+            <w:tcW w:type="dxa" w:w="1881"/>
+          </w:tcPr>
+          <w:p>
+            <w:pPr>
+              <w:jc w:val="center"/>
+            </w:pPr>
+            <w:r>
+              <w:rPr>
+                <w:sz w:val="20"/>
+              </w:rPr>
+              <w:t>100.0%</w:t>
+            </w:r>
+          </w:p>
+        </w:tc>
+      </w:tr>
+      <w:tr>
+        <w:tc>
+          <w:tcPr>
+            <w:tcW w:type="dxa" w:w="1881"/>
+          </w:tcPr>
+          <w:p>
+            <w:pPr>
+              <w:jc w:val="center"/>
+            </w:pPr>
+            <w:r>
+              <w:rPr>
+                <w:sz w:val="20"/>
+              </w:rPr>
+              <w:t>Flow + open</w:t>
+            </w:r>
+          </w:p>
+        </w:tc>
+        <w:tc>
+          <w:tcPr>
+            <w:tcW w:type="dxa" w:w="1881"/>
+          </w:tcPr>
+          <w:p>
+            <w:pPr>
+              <w:jc w:val="center"/>
+            </w:pPr>
+            <w:r>
+              <w:rPr>
+                <w:sz w:val="20"/>
+              </w:rPr>
+              <w:t>27</w:t>
+            </w:r>
+          </w:p>
+        </w:tc>
+        <w:tc>
+          <w:tcPr>
+            <w:tcW w:type="dxa" w:w="1881"/>
+          </w:tcPr>
+          <w:p>
+            <w:pPr>
+              <w:jc w:val="center"/>
+            </w:pPr>
+            <w:r>
+              <w:rPr>
+                <w:sz w:val="20"/>
+              </w:rPr>
+              <w:t>20</w:t>
+            </w:r>
+          </w:p>
+        </w:tc>
+        <w:tc>
+          <w:tcPr>
+            <w:tcW w:type="dxa" w:w="1881"/>
+          </w:tcPr>
+          <w:p>
+            <w:pPr>
+              <w:jc w:val="center"/>
+            </w:pPr>
+            <w:r>
+              <w:rPr>
+                <w:sz w:val="20"/>
+              </w:rPr>
+              <w:t>47</w:t>
+            </w:r>
+          </w:p>
+        </w:tc>
+        <w:tc>
+          <w:tcPr>
+            <w:tcW w:type="dxa" w:w="1881"/>
+          </w:tcPr>
+          <w:p>
+            <w:pPr>
+              <w:jc w:val="center"/>
+            </w:pPr>
+            <w:r>
+              <w:rPr>
+                <w:sz w:val="20"/>
+              </w:rPr>
+              <w:t>57.4%</w:t>
+            </w:r>
+          </w:p>
+        </w:tc>
+      </w:tr>
+    </w:tbl>
+    <w:p>
+      <w:r>
+        <w:rPr>
+          <w:i/>
+          <w:sz w:val="18"/>
+        </w:rPr>
+        <w:t>Fisher exact tests (one-sided): stock + closed vs. flow + open, OR = 3.70, p = 0.045; within stock, closed vs. open, OR = 2.50, p = 0.187; within flow, closed vs. open, OR = ∞, p = 0.126.</w:t>
+      </w:r>
+    </w:p>
+    <w:p>
+      <w:r>
+        <w:t>The pattern is consistent with the hypothesis that stock-orientation and network exclusion compound each other's risk, though the small cell sizes—particularly for flow + closed (n = 4)—warrant caution. The stock + closed combination is the only cell to reach a statistically significant difference from the baseline flow + open cell at conventional levels.</w:t>
       </w:r>
     </w:p>
     <w:p>

</xml_diff>

<commit_message>
Add Table S1 cross-references for conditional closure examples and survivors
- Discussion 6.2: examples paragraph now ends with '(Full details...
  in Supplementary Table S1)'
- Discussion 6.2: mixed-outcomes paragraph ends with reader redirect to
  Table S1 for all 96 polities
- Discussion 6.4: stock+closed survivors already reference Table S1

Co-Authored-By: Tatsuki Onishi <bougtoir@gmail.com>
</commit_message>
<xml_diff>
--- a/manuscript/manuscript.docx
+++ b/manuscript/manuscript.docx
@@ -2590,12 +2590,12 @@
     </w:p>
     <w:p>
       <w:r>
-        <w:t>This finding has a corollary that is worth stating explicitly. If the critical variable is not closure itself but the residual technology flow that closure permits, then polities that close their borders while deliberately maintaining selective channels for frontier knowledge occupy a qualitatively different position from those that are totally severed. Our dataset contains several instances of such conditional closure. Tokugawa Japan preserved access to Western science through rangaku at Dejima and was disrupted but not conquered, reconstituting itself as the Meiji state. Early Qing China maintained the Canton system—a single, tightly controlled port of trade through which some foreign knowledge filtered—and survived the Kangxi–Qianlong era intact. Joseon Korea sustained tributary trade with China, which served as a conduit for Continental knowledge and technology. The Soviet Union, while sealed from the Western bloc, maintained extensive technology sharing within the Eastern bloc and invested heavily in indigenous research institutions. North Korea has preserved a limited technology channel through its relationship with China.</w:t>
+        <w:t>This finding has a corollary that is worth stating explicitly. If the critical variable is not closure itself but the residual technology flow that closure permits, then polities that close their borders while deliberately maintaining selective channels for frontier knowledge occupy a qualitatively different position from those that are totally severed. Our dataset contains several instances of such conditional closure. Tokugawa Japan preserved access to Western science through rangaku at Dejima and was disrupted but not conquered, reconstituting itself as the Meiji state. Early Qing China maintained the Canton system—a single, tightly controlled port of trade through which some foreign knowledge filtered—and survived the Kangxi–Qianlong era intact. Joseon Korea sustained tributary trade with China, which served as a conduit for Continental knowledge and technology. The Soviet Union, while sealed from the Western bloc, maintained extensive technology sharing within the Eastern bloc and invested heavily in indigenous research institutions. North Korea has preserved a limited technology channel through its relationship with China. (Full details of each polity's closure regime, technology channels, and outcomes are recorded in Supplementary Table S1.)</w:t>
       </w:r>
     </w:p>
     <w:p>
       <w:r>
-        <w:t>The outcomes, however, are mixed. Early Qing China survived, but late Qing China—operating under the same Canton system—was semi-colonized after the Opium Wars. Tokugawa Japan survived as a political entity, but Joseon Korea, despite its Chinese conduit, was annexed by Japan in 1910. The Soviet Union collapsed internally despite its bloc-level technology sharing, while North Korea has persisted under extreme isolation with minimal Chinese patronage. These divergent outcomes suggest that the mere existence of a selective channel does not guarantee survival; unmeasured factors—the breadth and relevance of the knowledge flowing through the channel, the domestic capacity to absorb and adapt that knowledge, the pace of change at the technological frontier, and institutional dynamics that our dataset does not capture—likely condition the effectiveness of conditional closure. The policy question, then, is not binary (open or closed) but conditional, and the conditions under which selective channels suffice to prevent a fatal technology gap remain an open and consequential problem for future research.</w:t>
+        <w:t>The outcomes, however, are mixed. Early Qing China survived, but late Qing China—operating under the same Canton system—was semi-colonized after the Opium Wars. Tokugawa Japan survived as a political entity, but Joseon Korea, despite its Chinese conduit, was annexed by Japan in 1910. The Soviet Union collapsed internally despite its bloc-level technology sharing, while North Korea has persisted under extreme isolation with minimal Chinese patronage. These divergent outcomes suggest that the mere existence of a selective channel does not guarantee survival; unmeasured factors—the breadth and relevance of the knowledge flowing through the channel, the domestic capacity to absorb and adapt that knowledge, the pace of change at the technological frontier, and institutional dynamics that our dataset does not capture—likely condition the effectiveness of conditional closure. The policy question, then, is not binary (open or closed) but conditional, and the conditions under which selective channels suffice to prevent a fatal technology gap remain an open and consequential problem for future research. Readers interested in tracing these cases in detail are referred to Supplementary Table S1, which documents the specific turning-point events and outcomes for all 96 polities in the dataset.</w:t>
       </w:r>
     </w:p>
     <w:p>
@@ -3097,7 +3097,7 @@
     </w:p>
     <w:p>
       <w:r>
-        <w:t>The pattern is consistent with the hypothesis that stock-orientation and network exclusion compound each other's risk, though the small cell sizes—particularly for flow + closed (n = 4)—warrant caution. The stock + closed combination is the only cell to reach a statistically significant difference from the baseline flow + open cell at conventional levels.</w:t>
+        <w:t>The pattern is consistent with the hypothesis that stock-orientation and network exclusion compound each other's risk, though the small cell sizes—particularly for flow + closed (n = 4)—warrant caution. The stock + closed combination is the only cell to reach a statistically significant difference from the baseline flow + open cell at conventional levels. Notably, 3 stock-oriented polities with closure survived despite their high-risk classification; their individual characteristics—including specific closure regimes, technology channels maintained, and the historical circumstances of their survival—are documented in Supplementary Table S1.</w:t>
       </w:r>
     </w:p>
     <w:p>

</xml_diff>

<commit_message>
Add Tainter (1988), Acemoglu & Robinson (2012), Nunn (2008) to literature positioning
Introduction:
- New paragraph positions paper between internal-dynamics literature (Tainter's
  complexity collapse, Acemoglu & Robinson's extractive institutions) and
  external-connectivity literature (trade openness, technology diffusion)
- Argues network exclusion is the upstream cause that erodes both institutions
  and technological capacity

Discussion 6.1:
- Acemoglu & Robinson (2012) cited in mediator analysis: network access as the
  deeper variable upstream of institutional quality

Discussion 6.2:
- Nunn (2008) cited as empirical precedent for network disruption producing
  persistent underdevelopment (Africa's slave trades)

References:
- Added: Acemoglu & Robinson (2012), Nunn (2008), Tainter (1988),
  Turchin & Nefedov (2009)
- All in alphabetical order per Cliometrica author-year style

Co-Authored-By: Tatsuki Onishi <bougtoir@gmail.com>
</commit_message>
<xml_diff>
--- a/manuscript/manuscript.docx
+++ b/manuscript/manuscript.docx
@@ -94,7 +94,12 @@
     </w:p>
     <w:p>
       <w:r>
-        <w:t>The existing literature on trade openness and state survival has overwhelmingly focused on deliberate closure: the maritime prohibitions (haijin) of Ming China, the sakoku decree of Tokugawa Japan, the autarkic blocs of the Cold War. Deliberate closure is analytically convenient because it represents a policy choice with an identifiable agent. Yet this focus on intentional closure overlooks a logically prior question: what happens to polities that never had the option of connecting to the dominant network in the first place? The Khmer Empire at Angkor, the Kievan Rus' principality, or the Timurid dynasty were not isolated because their rulers chose closure; they were isolated because no regular maritime routes connected them to the major trading systems of their era. If these polities exhibit the same elevated conquest risk as deliberately closed ones, then the mechanism at work is not the policy decision to close but the disconnection itself.</w:t>
+        <w:t>The existing literature offers two broad explanations for why states fail. One emphasizes internal dynamics: Tainter (1988) argued that complex societies collapse when the marginal returns to increasing complexity decline, and Acemoglu and Robinson (2012) showed that extractive institutions—those that concentrate power and discourage innovation—undermine long-run prosperity. The other emphasizes external connectivity: trade openness, technology diffusion, and the consequences of isolation (Findlay and O'Rourke 2007; Mokyr 2002). Our contribution lies at the intersection. We argue that disconnection from the dominant exchange network is an upstream cause that erodes both institutional quality and technological capacity—the very factors that the internal-dynamics literature identifies as proximate causes of collapse.</w:t>
+      </w:r>
+    </w:p>
+    <w:p>
+      <w:r>
+        <w:t>The literature on trade and isolation has overwhelmingly focused on deliberate closure: the maritime prohibitions (haijin) of Ming China, the sakoku decree of Tokugawa Japan, the autarkic blocs of the Cold War. Deliberate closure is analytically convenient because it represents a policy choice with an identifiable agent. Yet this focus on intentional closure overlooks a logically prior question: what happens to polities that never had the option of connecting to the dominant network in the first place? The Khmer Empire at Angkor, the Kievan Rus' principality, or the Timurid dynasty were not isolated because their rulers chose closure; they were isolated because no regular maritime routes connected them to the major trading systems of their era. If these polities exhibit the same elevated conquest risk as deliberately closed ones, then the mechanism at work is not the policy decision to close but the disconnection itself.</w:t>
       </w:r>
     </w:p>
     <w:p>
@@ -2562,7 +2567,7 @@
     </w:p>
     <w:p>
       <w:r>
-        <w:t>The multivariate results complete the picture. External threat and institutional quality are the strongest predictors of conquest, and the maritime closure indicator loses significance after their inclusion (Table 3, Fig. 4). This is precisely what a technology-gap mechanism would predict: closure does not kill states directly. Rather, it initiates a causal chain—technological stagnation erodes institutional adaptive capacity, which in turn leaves the polity unable to respond to external threats. The mediating variables (external threat, institutional quality) absorb the explanatory power of the closure variable because they lie downstream in the causal pathway.</w:t>
+        <w:t>The multivariate results complete the picture. External threat and institutional quality are the strongest predictors of conquest, and the maritime closure indicator loses significance after their inclusion (Table 3, Fig. 4). This is precisely what a technology-gap mechanism would predict: closure does not kill states directly. Rather, it initiates a causal chain—technological stagnation erodes institutional adaptive capacity, which in turn leaves the polity unable to respond to external threats. This causal ordering is consistent with Acemoglu and Robinson's (2012) emphasis on institutions as the proximate determinant of national success, while suggesting that network access is the deeper, upstream variable: exclusion degrades the very institutions that the inclusive-institutions framework identifies as essential. The mediating variables (external threat, institutional quality) absorb the explanatory power of the closure variable because they lie downstream in the causal pathway.</w:t>
       </w:r>
     </w:p>
     <w:p>
@@ -2580,7 +2585,7 @@
     </w:p>
     <w:p>
       <w:r>
-        <w:t>The mechanism we propose is cumulative divergence through technology flow disruption. International exchange networks carried not only goods but military techniques, metallurgical innovations, navigational knowledge, and institutional models (Mokyr 2002; Pomeranz 2000). Polities connected to these networks could adopt, adapt, and build upon innovations generated elsewhere. Polities severed from them could not. Over generations, the technology gap widened. When contact eventually occurred—typically through military expansion by the more connected civilization—the accumulated gap proved decisive. The Han Dynasty encountered Central Asian and eventually Roman-linked military traditions; the Khmer Empire faced the expanding Siamese and Vietnamese states that were integrated into maritime trade networks; Kievan Rus' was overrun by the Mongol armies that had absorbed the military technologies of multiple civilizations across Eurasia.</w:t>
+        <w:t>The mechanism we propose is cumulative divergence through technology flow disruption. International exchange networks carried not only goods but military techniques, metallurgical innovations, navigational knowledge, and institutional models (Mokyr 2002; Pomeranz 2000). Polities connected to these networks could adopt, adapt, and build upon innovations generated elsewhere. Polities severed from them could not. Over generations, the technology gap widened—a process analogous to the long-run consequences of network disruption documented by Nunn (2008), who showed that regions more heavily affected by the slave trade experienced persistent underdevelopment centuries later. When contact with a more advanced civilization eventually occurred—often through military expansion—the accumulated gap proved decisive. The Han Dynasty encountered Central Asian and eventually Roman-linked military traditions; the Khmer Empire faced the expanding Siamese and Vietnamese states that were integrated into maritime trade networks; Kievan Rus’ was overrun by the Mongol armies that had absorbed the military technologies of multiple civilizations across Eurasia.</w:t>
       </w:r>
     </w:p>
     <w:p>
@@ -3174,6 +3179,17 @@
         <w:rPr>
           <w:sz w:val="22"/>
         </w:rPr>
+        <w:t>Acemoglu D, Robinson JA (2012) Why nations fail: the origins of power, prosperity, and poverty. Crown, New York</w:t>
+      </w:r>
+    </w:p>
+    <w:p>
+      <w:pPr>
+        <w:ind w:hanging="567" w:left="567"/>
+      </w:pPr>
+      <w:r>
+        <w:rPr>
+          <w:sz w:val="22"/>
+        </w:rPr>
         <w:t>Acemoglu D, Restrepo P (2020) Robots and jobs: evidence from US labor markets. J Polit Econ 128:2188–2244. https://doi.org/10.1086/705716</w:t>
       </w:r>
     </w:p>
@@ -3317,6 +3333,17 @@
         <w:rPr>
           <w:sz w:val="22"/>
         </w:rPr>
+        <w:t>Nunn N (2008) The long-term effects of Africa's slave trades. Q J Econ 123:139–176. https://doi.org/10.1162/qjec.2008.123.1.139</w:t>
+      </w:r>
+    </w:p>
+    <w:p>
+      <w:pPr>
+        <w:ind w:hanging="567" w:left="567"/>
+      </w:pPr>
+      <w:r>
+        <w:rPr>
+          <w:sz w:val="22"/>
+        </w:rPr>
         <w:t>Pomeranz K (2000) The great divergence: China, Europe, and the making of the modern world economy. Princeton University Press, Princeton</w:t>
       </w:r>
     </w:p>
@@ -3328,7 +3355,29 @@
         <w:rPr>
           <w:sz w:val="22"/>
         </w:rPr>
+        <w:t>Tainter JA (1988) The collapse of complex societies. Cambridge University Press, Cambridge</w:t>
+      </w:r>
+    </w:p>
+    <w:p>
+      <w:pPr>
+        <w:ind w:hanging="567" w:left="567"/>
+      </w:pPr>
+      <w:r>
+        <w:rPr>
+          <w:sz w:val="22"/>
+        </w:rPr>
         <w:t>Turchin P (2009) A theory for formation of large empires. J Glob Hist 4:191–217. https://doi.org/10.1017/S1740022809003192</w:t>
+      </w:r>
+    </w:p>
+    <w:p>
+      <w:pPr>
+        <w:ind w:hanging="567" w:left="567"/>
+      </w:pPr>
+      <w:r>
+        <w:rPr>
+          <w:sz w:val="22"/>
+        </w:rPr>
+        <w:t>Turchin P, Nefedov SA (2009) Secular cycles. Princeton University Press, Princeton</w:t>
       </w:r>
     </w:p>
     <w:p>

</xml_diff>

<commit_message>
Fix brace-matching bugs in generate_docx.py (abstract/caption truncation)
Use extract_braced() for \abstract{}, \caption{}, and \footnotetext{}
instead of non-greedy regex that truncates at first internal closing brace.

Co-Authored-By: Tatsuki Onishi <bougtoir@gmail.com>
</commit_message>
<xml_diff>
--- a/manuscript/manuscript.docx
+++ b/manuscript/manuscript.docx
@@ -54,7 +54,7 @@
         <w:ind w:firstLine="0"/>
       </w:pPr>
       <w:r>
-        <w:t>Why do some states collapse while others endure? This study proposes that structural exclusion from the dominant technological network of an era—not merely deliberate trade closure—is a recurring driver of state vulnerability, because it severs the flow of technical knowledge and allows a cumulative technology gap to open between connected and excluded polities. Using a comparative dataset of 96 historical polities spanning antiquity to the present, we distinguish between policy-driven isolation (e.g., Ming {haijin</w:t>
+        <w:t>Why do some states collapse while others endure? This study proposes that structural exclusion from the dominant technological network of an era—not merely deliberate trade closure—is a recurring driver of state vulnerability, because it severs the flow of technical knowledge and allows a cumulative technology gap to open between connected and excluded polities. Using a comparative dataset of 96 historical polities spanning antiquity to the present, we distinguish between policy-driven isolation (e.g., Ming haijin, Tokugawa sakoku) and what we term 'technical network exclusion': involuntary disconnection from prevailing exchange networks due to geographic or technological constraints. Policy-based closure reduces but does not eliminate technology transfer (e.g., rangaku via Dejima under sakoku), whereas technical exclusion severs it entirely. Reclassifying seven technically excluded polities transforms a non-significant association between closure and conquest (Fisher's exact test p = 0.187) into a significant one (p = 0.020); all seven were eventually conquered. We probe this result with four causal identification strategies—instrumental variables, propensity score matching, a natural experiment framing, and a battery of robustness checks including E-values, permutation tests, and leave-one-out analysis. The strongest evidence comes from the natural experiment approach: technically excluded polities show a 100% conquest rate compared with 62.3% for open polities (p = 0.048), with no significant differences in observable covariates, and a dose–response gradient tracking the degree of technology flow disruption (Cochran–Armitage p = 0.054). The stock–flow odds ratio (OR = 1.774) remains stable across all specifications (leave-one-out range [1.685, 1.935]; E-value = 2.95). We argue that the underlying mechanism—technology flow disruption leading to an accumulating civilization-level gap—generalizes beyond maritime isolation. As the dominant network shifts from sea lanes to semiconductors, artificial intelligence, and advanced robotics, states structurally excluded from these technological platforms may face analogous vulnerabilities.</w:t>
       </w:r>
     </w:p>
     <w:p/>
@@ -843,7 +843,7 @@
         <w:t xml:space="preserve">Table 2. </w:t>
       </w:r>
       <w:r>
-        <w:t>Network closure and conquest across six scenarios. $^{*</w:t>
+        <w:t>Network closure and conquest across six scenarios. ^* p &lt; 0.05.</w:t>
       </w:r>
     </w:p>
     <w:tbl>
@@ -1892,7 +1892,7 @@
         <w:t xml:space="preserve">Table 3. </w:t>
       </w:r>
       <w:r>
-        <w:t>Multivariate logistic regression results (7-country reclassification, disrupted overtaken). $^{*</w:t>
+        <w:t>Multivariate logistic regression results (7-country reclassification, disrupted overtaken). ^* p &lt; 0.05, ^ p &lt; 0.10.</w:t>
       </w:r>
     </w:p>
     <w:tbl>

</xml_diff>

<commit_message>
fix: avoid double period on paragraph titles ending with '.'
Co-Authored-By: Tatsuki Onishi <bougtoir@gmail.com>
</commit_message>
<xml_diff>
--- a/manuscript/manuscript.docx
+++ b/manuscript/manuscript.docx
@@ -751,7 +751,7 @@
         <w:rPr>
           <w:b/>
         </w:rPr>
-        <w:t xml:space="preserve">Instrumental variables (2SLS).. </w:t>
+        <w:t xml:space="preserve">Instrumental variables (2SLS). </w:t>
       </w:r>
     </w:p>
     <w:p>
@@ -764,7 +764,7 @@
         <w:rPr>
           <w:b/>
         </w:rPr>
-        <w:t xml:space="preserve">Propensity score matching (PSM).. </w:t>
+        <w:t xml:space="preserve">Propensity score matching (PSM). </w:t>
       </w:r>
     </w:p>
     <w:p>
@@ -777,7 +777,7 @@
         <w:rPr>
           <w:b/>
         </w:rPr>
-        <w:t xml:space="preserve">Natural experiment framing.. </w:t>
+        <w:t xml:space="preserve">Natural experiment framing. </w:t>
       </w:r>
     </w:p>
     <w:p>
@@ -790,7 +790,7 @@
         <w:rPr>
           <w:b/>
         </w:rPr>
-        <w:t xml:space="preserve">Robustness battery.. </w:t>
+        <w:t xml:space="preserve">Robustness battery. </w:t>
       </w:r>
     </w:p>
     <w:p>
@@ -3010,7 +3010,7 @@
         <w:rPr>
           <w:b/>
         </w:rPr>
-        <w:t xml:space="preserve">E-value.. </w:t>
+        <w:t xml:space="preserve">E-value. </w:t>
       </w:r>
     </w:p>
     <w:p>
@@ -3023,7 +3023,7 @@
         <w:rPr>
           <w:b/>
         </w:rPr>
-        <w:t xml:space="preserve">Permutation test.. </w:t>
+        <w:t xml:space="preserve">Permutation test. </w:t>
       </w:r>
     </w:p>
     <w:p>
@@ -3036,7 +3036,7 @@
         <w:rPr>
           <w:b/>
         </w:rPr>
-        <w:t xml:space="preserve">Leave-one-out analysis.. </w:t>
+        <w:t xml:space="preserve">Leave-one-out analysis. </w:t>
       </w:r>
     </w:p>
     <w:p>
@@ -3049,7 +3049,7 @@
         <w:rPr>
           <w:b/>
         </w:rPr>
-        <w:t xml:space="preserve">Alternative outcome definitions.. </w:t>
+        <w:t xml:space="preserve">Alternative outcome definitions. </w:t>
       </w:r>
     </w:p>
     <w:p>
@@ -3062,7 +3062,7 @@
         <w:rPr>
           <w:b/>
         </w:rPr>
-        <w:t xml:space="preserve">Bootstrap confidence intervals.. </w:t>
+        <w:t xml:space="preserve">Bootstrap confidence intervals. </w:t>
       </w:r>
     </w:p>
     <w:p>
@@ -3075,7 +3075,7 @@
         <w:rPr>
           <w:b/>
         </w:rPr>
-        <w:t xml:space="preserve">Multicollinearity.. </w:t>
+        <w:t xml:space="preserve">Multicollinearity. </w:t>
       </w:r>
     </w:p>
     <w:p>

</xml_diff>

<commit_message>
chore: JEL C12 → C25 (Discrete Regression and Qualitative Choice Models)
Co-Authored-By: Tatsuki Onishi <bougtoir@gmail.com>
</commit_message>
<xml_diff>
--- a/manuscript/manuscript.docx
+++ b/manuscript/manuscript.docx
@@ -77,7 +77,7 @@
         <w:t xml:space="preserve">JEL Classification: </w:t>
       </w:r>
       <w:r>
-        <w:t>N40, N70, F50, O33, C12</w:t>
+        <w:t>N40, N70, F50, O33, C25</w:t>
       </w:r>
     </w:p>
     <w:p>
@@ -3697,7 +3697,7 @@
         <w:t xml:space="preserve">JEL Classification: </w:t>
       </w:r>
       <w:r>
-        <w:t>N40, N70, F50, O33, C12</w:t>
+        <w:t>N40, N70, F50, O33, C25</w:t>
       </w:r>
     </w:p>
     <w:p>

</xml_diff>

<commit_message>
fix: sort references by (author, year) for Harvard style
Co-Authored-By: Tatsuki Onishi <bougtoir@gmail.com>
</commit_message>
<xml_diff>
--- a/manuscript/manuscript.docx
+++ b/manuscript/manuscript.docx
@@ -3757,7 +3757,7 @@
         <w:ind w:hanging="720" w:left="720"/>
       </w:pPr>
       <w:r>
-        <w:t>Acemoglu, Daron and Robinson, James A.. Why Nations Fail: The Origins of Power, Prosperity, and Poverty. New York: Crown, 2012.</w:t>
+        <w:t>Acemoglu, Daron and Robinson, James A.. Economic Origins of Dictatorship and Democracy. Cambridge: Cambridge University Press, 2006.</w:t>
       </w:r>
     </w:p>
     <w:p>
@@ -3766,7 +3766,7 @@
         <w:ind w:hanging="720" w:left="720"/>
       </w:pPr>
       <w:r>
-        <w:t>Acemoglu, Daron and Robinson, James A.. Economic Origins of Dictatorship and Democracy. Cambridge: Cambridge University Press, 2006.</w:t>
+        <w:t>Acemoglu, Daron and Robinson, James A.. Why Nations Fail: The Origins of Power, Prosperity, and Poverty. New York: Crown, 2012.</w:t>
       </w:r>
     </w:p>
     <w:p>

</xml_diff>